<commit_message>
Bölüm 7: Soru 9 tekrarı giderildi, dönem başlıkları büyük harfe çevrildi
- Soru 7'nin kaynak listesinin üstüne yapışmış kayık "Soru 9" başlığı silindi.
  Soru 7'nin sentez paragrafı ile kaynakları arasına girmiş, cevap gövdesi
  taşımıyordu; kaynakların parantez içi notları Soru 7 (volatil/TİVA) konulu.
  Gövdedeki soru sırası artık 1-13, tekrar yok. Silinen tek paragraf bu başlık.
- Dönem başlıkları Bölüm 4 kalıbındaki gibi BÜYÜK HARF yapıldı (Türkçe uyumlu
  dönüşüm: i->İ, ı->I; Roma rakamları korundu).

Co-Authored-By: Claude Opus 5 <noreply@anthropic.com>
</commit_message>
<xml_diff>
--- a/Bolum7_Timektomi_Anestezi_Yonetimi_Soru_Cevap.docx
+++ b/Bolum7_Timektomi_Anestezi_Yonetimi_Soru_Cevap.docx
@@ -106,7 +106,7 @@
           <w:u w:val="none"/>
           <w:lang/>
         </w:rPr>
-        <w:t>I. Preoperatif Değerlendirme ve Optimizasyon</w:t>
+        <w:t>I. PREOPERATİF DEĞERLENDİRME VE OPTİMİZASYON</w:t>
       </w:r>
     </w:p>
     <w:p>
@@ -216,7 +216,7 @@
           <w:u w:val="none"/>
           <w:lang/>
         </w:rPr>
-        <w:t>II. Anestezi Yönetimi ve İntraoperatif Stratejiler</w:t>
+        <w:t>II. ANESTEZİ YÖNETİMİ VE İNTRAOPERATİF STRATEJİLER</w:t>
       </w:r>
     </w:p>
     <w:p>
@@ -348,7 +348,7 @@
           <w:u w:val="none"/>
           <w:lang/>
         </w:rPr>
-        <w:t>III. Geri Döndürme, Ekstübasyon ve Postoperatif Bakım</w:t>
+        <w:t>III. GERİ DÖNDÜRME, EKSTÜBASYON VE POSTOPERATİF BAKIM</w:t>
       </w:r>
     </w:p>
     <w:p>
@@ -458,7 +458,7 @@
           <w:u w:val="none"/>
           <w:lang/>
         </w:rPr>
-        <w:t>I. Preoperatif Değerlendirme ve Optimizasyon</w:t>
+        <w:t>I. PREOPERATİF DEĞERLENDİRME VE OPTİMİZASYON</w:t>
       </w:r>
     </w:p>
     <w:p>
@@ -2867,7 +2867,7 @@
           <w:u w:val="none"/>
           <w:lang/>
         </w:rPr>
-        <w:t>II. Anestezi Yönetimi ve İntraoperatif Stratejiler</w:t>
+        <w:t>II. ANESTEZİ YÖNETİMİ VE İNTRAOPERATİF STRATEJİLER</w:t>
       </w:r>
     </w:p>
     <w:p>
@@ -4126,6 +4126,72 @@
     </w:p>
     <w:p>
       <w:pPr>
+        <w:spacing w:after="0" w:line="360" w:lineRule="auto" w:before="0"/>
+        <w:ind w:left="0" w:firstLine="0" w:right="0"/>
+        <w:jc w:val="both"/>
+        <w:rPr>
+          <w:lang/>
+        </w:rPr>
+      </w:pPr>
+      <w:r>
+        <w:rPr>
+          <w:rFonts w:ascii="Times New Roman" w:hAnsi="Times New Roman" w:cs="Times New Roman" w:eastAsia="Times New Roman"/>
+          <w:b w:val="0"/>
+          <w:bCs/>
+          <w:i w:val="0"/>
+          <w:sz w:val="22"/>
+          <w:u w:val="none"/>
+          <w:lang/>
+        </w:rPr>
+        <w:t>Miller's Anesthesia (9th Edition, 2020) - Chapter 39: Anesthesia for Patients with Neuromuscular Disease &amp; Chapter 69: Anesthesia for Thoracic Surgery. (Volatil anesteziklerin postsinaptik nikotinik reseptörler üzerindeki inhibitör mekanizmalarını, kas gevşeticilerle olan sinerjistik etkileşimlerini ve TİVA'nın nöromüsküler monitörizasyondaki prediktif avantajlarını sunan temel textbook referansıdır.)</w:t>
+      </w:r>
+    </w:p>
+    <w:p>
+      <w:pPr>
+        <w:spacing w:after="0" w:line="360" w:lineRule="auto" w:before="0"/>
+        <w:ind w:left="0" w:firstLine="0" w:right="0"/>
+        <w:jc w:val="both"/>
+        <w:rPr>
+          <w:lang/>
+        </w:rPr>
+      </w:pPr>
+      <w:r>
+        <w:rPr>
+          <w:rFonts w:ascii="Times New Roman" w:hAnsi="Times New Roman" w:cs="Times New Roman" w:eastAsia="Times New Roman"/>
+          <w:b w:val="0"/>
+          <w:bCs/>
+          <w:i w:val="0"/>
+          <w:sz w:val="22"/>
+          <w:u w:val="none"/>
+          <w:lang/>
+        </w:rPr>
+        <w:t>Blichfeldt-Lauridsen, L., &amp; Hansen, B. D. (2012). Anesthesia and myasthenia gravis. Acta Anaesthesiologica Scandinavica, 56(10), 1215-1225. (Sevofluran ve desfluranın MG olgularında NMB gereksinimini ne oranda azalttığını ve TİVA kombinasyonlarının erken ekstübasyon süreleri üzerindeki klinik karşılaştırmalarını içeren rehber makaledir.)</w:t>
+      </w:r>
+    </w:p>
+    <w:p>
+      <w:pPr>
+        <w:spacing w:after="0" w:line="360" w:lineRule="auto" w:before="0"/>
+        <w:ind w:left="0" w:firstLine="0" w:right="0"/>
+        <w:jc w:val="both"/>
+        <w:rPr>
+          <w:lang/>
+        </w:rPr>
+      </w:pPr>
+      <w:r>
+        <w:rPr>
+          <w:rFonts w:ascii="Times New Roman" w:hAnsi="Times New Roman" w:cs="Times New Roman" w:eastAsia="Times New Roman"/>
+          <w:b w:val="0"/>
+          <w:bCs/>
+          <w:i w:val="0"/>
+          <w:sz w:val="22"/>
+          <w:u w:val="none"/>
+          <w:lang/>
+        </w:rPr>
+        <w:t>Anestezi Pratiğinde Nöromüsküler Hastalıklara Yaklaşım Kılavuzları (Torasik ve Robotik Cerrahi Serisi).(Robotik timektomilerde hareketsizliğin önemi ile MG patofizyolojisindeki postoperatif solunum yetmezliği risklerinin yönetiminde anestezi idame ajanlarının titrasyon protokollerini içeren klinik kaynağımızdır.)</w:t>
+      </w:r>
+    </w:p>
+    <w:p>
+      <w:pPr>
         <w:spacing w:after="120" w:line="360" w:lineRule="auto" w:before="0"/>
         <w:ind w:firstLine="0" w:left="0" w:right="0"/>
         <w:jc w:val="left"/>
@@ -4147,12 +4213,371 @@
           <w:u w:val="none"/>
           <w:lang/>
         </w:rPr>
-        <w:t>Soru 9 (Monitörizasyon): Nöromüsküler fonksiyonun intraoperatif takibinde kantitatif "Train-of-Four" (TOF) monitörizasyonu neden altın standarttır? Yalnızca klinik belirtilere (örneğin solunum eforu) veya kalitatif TOF (görsel/taktil) değerlendirmesine güvenmek neden risklidir?</w:t>
-      </w:r>
-    </w:p>
-    <w:p>
-      <w:pPr>
-        <w:spacing w:after="0" w:line="360" w:lineRule="auto" w:before="0"/>
+        <w:t>Soru 8 (Robotik Cerrahi Fizyolojisi): Robotik timektomi sırasında uygulanacak CO2​ insüflasyonunun (kapnotoraks) ve hastaya verilecek pozisyonun intratorasik basınç, akciğer kompliyansı, venöz dönüş ve genel hemodinami üzerindeki olası etkileri nelerdir? Anestezi ekibi bu fizyolojik değişiklikleri akciğer koruyucu ventilasyon parametreleriyle nasıl yönetmelidir?</w:t>
+      </w:r>
+    </w:p>
+    <w:p>
+      <w:pPr>
+        <w:spacing w:line="360" w:lineRule="auto" w:after="0" w:before="0"/>
+        <w:ind w:firstLine="0" w:left="0" w:right="0"/>
+        <w:jc w:val="both"/>
+        <w:rPr>
+          <w:lang/>
+        </w:rPr>
+      </w:pPr>
+      <w:r>
+        <w:rPr>
+          <w:rFonts w:ascii="Times New Roman" w:hAnsi="Times New Roman" w:cs="Times New Roman" w:eastAsia="Times New Roman"/>
+          <w:b w:val="0"/>
+          <w:i w:val="0"/>
+          <w:sz w:val="22"/>
+          <w:u w:val="none"/>
+          <w:lang/>
+        </w:rPr>
+        <w:t>Robotik timektomide (RATS) uygulanan yapay kapnotoraks ve cerrahi pozisyonlama, göğüs kafesi açık yapılan geleneksel cerrahilerden tamamen farklı bir fizyopatolojik tablo yaratır. Güncel ERAS (Cerrahi Sonrası Erken Derlenme) protokolleri ve modern torasik anestezi kılavuzları ışığında, bu mekanik etkileri ve akciğer koruyucu ventilasyon (AKV) yönetimini en güncel klinik yaklaşımlarla yeniden ele alalım.</w:t>
+      </w:r>
+    </w:p>
+    <w:p>
+      <w:pPr>
+        <w:spacing w:line="360" w:lineRule="auto" w:after="0" w:before="0"/>
+        <w:ind w:firstLine="0" w:left="0" w:right="0"/>
+        <w:jc w:val="both"/>
+        <w:rPr>
+          <w:b/>
+          <w:bCs/>
+          <w:lang/>
+        </w:rPr>
+      </w:pPr>
+      <w:r>
+        <w:rPr>
+          <w:rFonts w:ascii="Times New Roman" w:hAnsi="Times New Roman" w:cs="Times New Roman" w:eastAsia="Times New Roman"/>
+          <w:b w:val="0"/>
+          <w:bCs/>
+          <w:i w:val="0"/>
+          <w:sz w:val="22"/>
+          <w:u w:val="none"/>
+          <w:lang/>
+        </w:rPr>
+        <w:t>1. Kapnotoraks ve Pozisyonun Güncel Fizyopatolojik Analizi</w:t>
+      </w:r>
+    </w:p>
+    <w:p>
+      <w:pPr>
+        <w:spacing w:line="360" w:lineRule="auto" w:after="0" w:before="0"/>
+        <w:ind w:firstLine="0" w:left="0" w:right="0"/>
+        <w:jc w:val="both"/>
+        <w:rPr>
+          <w:lang/>
+        </w:rPr>
+      </w:pPr>
+      <w:r>
+        <w:rPr>
+          <w:rFonts w:ascii="Times New Roman" w:hAnsi="Times New Roman" w:cs="Times New Roman" w:eastAsia="Times New Roman"/>
+          <w:b w:val="0"/>
+          <w:i w:val="0"/>
+          <w:sz w:val="22"/>
+          <w:u w:val="none"/>
+          <w:lang/>
+        </w:rPr>
+        <w:t>Modern cerrahide plevral boşluğa uygulanan CO2​ insüflasyonu (8−12 mmHg) ve hastaya verilen yarı lateral/reverse Trendelenburg pozisyonu iki temel cephede meydan okuma yaratır:</w:t>
+      </w:r>
+    </w:p>
+    <w:p>
+      <w:pPr>
+        <w:spacing w:line="360" w:lineRule="auto" w:after="0" w:before="0"/>
+        <w:ind w:firstLine="0" w:left="0" w:right="0"/>
+        <w:jc w:val="both"/>
+        <w:rPr>
+          <w:b/>
+          <w:bCs/>
+          <w:lang/>
+        </w:rPr>
+      </w:pPr>
+      <w:r>
+        <w:rPr>
+          <w:rFonts w:ascii="Times New Roman" w:hAnsi="Times New Roman" w:cs="Times New Roman" w:eastAsia="Times New Roman"/>
+          <w:b w:val="0"/>
+          <w:bCs/>
+          <w:i w:val="0"/>
+          <w:sz w:val="22"/>
+          <w:u w:val="none"/>
+          <w:lang/>
+        </w:rPr>
+        <w:t>Solunum Mekanikleri Üzerindeki Baskı</w:t>
+      </w:r>
+    </w:p>
+    <w:p>
+      <w:pPr>
+        <w:spacing w:line="360" w:lineRule="auto" w:after="0" w:before="0"/>
+        <w:ind w:firstLine="0" w:left="0" w:right="0"/>
+        <w:jc w:val="both"/>
+        <w:rPr>
+          <w:lang/>
+        </w:rPr>
+      </w:pPr>
+      <w:r>
+        <w:rPr>
+          <w:rFonts w:ascii="Times New Roman" w:hAnsi="Times New Roman" w:cs="Times New Roman" w:eastAsia="Times New Roman"/>
+          <w:b w:val="0"/>
+          <w:bCs/>
+          <w:i w:val="0"/>
+          <w:sz w:val="22"/>
+          <w:u w:val="none"/>
+          <w:lang/>
+        </w:rPr>
+        <w:t>Atelektazi ve Şant: Yüksek intratorasik basınç, bağımlı akciğer alanlarında mikro-atelektazilere yol açarak ventilasyon/perfüzyon (V/Q) uyumsuzluğunu derinleştirir. Akciğer kompliyansı %30 ila %40 oranında azalır.</w:t>
+      </w:r>
+    </w:p>
+    <w:p>
+      <w:pPr>
+        <w:spacing w:line="360" w:lineRule="auto" w:after="0" w:before="0"/>
+        <w:ind w:firstLine="0" w:left="0" w:right="0"/>
+        <w:jc w:val="both"/>
+        <w:rPr>
+          <w:lang/>
+        </w:rPr>
+      </w:pPr>
+      <w:r>
+        <w:rPr>
+          <w:rFonts w:ascii="Times New Roman" w:hAnsi="Times New Roman" w:cs="Times New Roman" w:eastAsia="Times New Roman"/>
+          <w:b w:val="0"/>
+          <w:bCs/>
+          <w:i w:val="0"/>
+          <w:sz w:val="22"/>
+          <w:u w:val="none"/>
+          <w:lang/>
+        </w:rPr>
+        <w:t>Hiperkapni ve Asidoz: Plevra yüzeyinden sürekli absorbe olan CO2​, sistemik solunumsal asidoza neden olur. Asidoz ise Myastenia Gravis hastalarında nöromüsküler iletim blokajını potansiyalize edebileceği için yakından yönetilmelidir.</w:t>
+      </w:r>
+    </w:p>
+    <w:p>
+      <w:pPr>
+        <w:spacing w:line="360" w:lineRule="auto" w:after="0" w:before="0"/>
+        <w:ind w:firstLine="0" w:left="0" w:right="0"/>
+        <w:jc w:val="both"/>
+        <w:rPr>
+          <w:b/>
+          <w:bCs/>
+          <w:lang/>
+        </w:rPr>
+      </w:pPr>
+      <w:r>
+        <w:rPr>
+          <w:rFonts w:ascii="Times New Roman" w:hAnsi="Times New Roman" w:cs="Times New Roman" w:eastAsia="Times New Roman"/>
+          <w:b w:val="0"/>
+          <w:bCs/>
+          <w:i w:val="0"/>
+          <w:sz w:val="22"/>
+          <w:u w:val="none"/>
+          <w:lang/>
+        </w:rPr>
+        <w:t>Hemodinamik Etkiler (Preload ve Afterload Çatışması)</w:t>
+      </w:r>
+    </w:p>
+    <w:p>
+      <w:pPr>
+        <w:spacing w:line="360" w:lineRule="auto" w:after="0" w:before="0"/>
+        <w:ind w:firstLine="0" w:left="0" w:right="0"/>
+        <w:jc w:val="both"/>
+        <w:rPr>
+          <w:lang/>
+        </w:rPr>
+      </w:pPr>
+      <w:r>
+        <w:rPr>
+          <w:rFonts w:ascii="Times New Roman" w:hAnsi="Times New Roman" w:cs="Times New Roman" w:eastAsia="Times New Roman"/>
+          <w:b w:val="0"/>
+          <w:bCs/>
+          <w:i w:val="0"/>
+          <w:sz w:val="22"/>
+          <w:u w:val="none"/>
+          <w:lang/>
+        </w:rPr>
+        <w:t>Kardiyak Output Düşüşü: Göğüs içi basıncın artması vena cava üstündeki mekanik basıyı artırarak venöz dönüşü (preload) azaltır. Eş zamanlı olarak hipoksi ve hiperkapniye bağlı pulmoner vazokonstrüksiyon, sağ ventrikül art yükünü (afterload) yükseltir.</w:t>
+      </w:r>
+    </w:p>
+    <w:p>
+      <w:pPr>
+        <w:spacing w:line="360" w:lineRule="auto" w:after="0" w:before="0"/>
+        <w:ind w:firstLine="0" w:left="0" w:right="0"/>
+        <w:jc w:val="both"/>
+        <w:rPr>
+          <w:lang/>
+        </w:rPr>
+      </w:pPr>
+      <w:r>
+        <w:rPr>
+          <w:rFonts w:ascii="Times New Roman" w:hAnsi="Times New Roman" w:cs="Times New Roman" w:eastAsia="Times New Roman"/>
+          <w:b w:val="0"/>
+          <w:bCs/>
+          <w:i w:val="0"/>
+          <w:sz w:val="22"/>
+          <w:u w:val="none"/>
+          <w:lang/>
+        </w:rPr>
+        <w:t>Sempatik Aktivasyon: Absorbe olan gazın yarattığı hiperkapni sempatik sistemi uyararak maskelenmiş bir hipertansiyon ve taşikardi tablosu yaratabilir; bu durum gerçek hacim statüsünü (hipovolemiyi) gizleyebilir.</w:t>
+      </w:r>
+    </w:p>
+    <w:p>
+      <w:pPr>
+        <w:spacing w:line="360" w:lineRule="auto" w:after="0" w:before="0"/>
+        <w:ind w:firstLine="0" w:left="0" w:right="0"/>
+        <w:jc w:val="both"/>
+        <w:rPr>
+          <w:b/>
+          <w:bCs/>
+          <w:lang/>
+        </w:rPr>
+      </w:pPr>
+      <w:r>
+        <w:rPr>
+          <w:rFonts w:ascii="Times New Roman" w:hAnsi="Times New Roman" w:cs="Times New Roman" w:eastAsia="Times New Roman"/>
+          <w:b w:val="0"/>
+          <w:bCs/>
+          <w:i w:val="0"/>
+          <w:sz w:val="22"/>
+          <w:u w:val="none"/>
+          <w:lang/>
+        </w:rPr>
+        <w:t>2. Güncel Akciğer Koruyucu Ventilasyon (AKV) Stratejisi</w:t>
+      </w:r>
+    </w:p>
+    <w:p>
+      <w:pPr>
+        <w:spacing w:line="360" w:lineRule="auto" w:after="0" w:before="0"/>
+        <w:ind w:firstLine="0" w:left="0" w:right="0"/>
+        <w:jc w:val="both"/>
+        <w:rPr>
+          <w:lang/>
+        </w:rPr>
+      </w:pPr>
+      <w:r>
+        <w:rPr>
+          <w:rFonts w:ascii="Times New Roman" w:hAnsi="Times New Roman" w:cs="Times New Roman" w:eastAsia="Times New Roman"/>
+          <w:b w:val="0"/>
+          <w:i w:val="0"/>
+          <w:sz w:val="22"/>
+          <w:u w:val="none"/>
+          <w:lang/>
+        </w:rPr>
+        <w:t>Hastamızın bazal vital kapasitesinin 2.5 L olduğunu düşündüğümüzde, ameliyat sonu hızlı ekstübasyon (fast-track) başarısı tamamen intraoperatif ventilatör stratejisine bağlıdır. Güncel kılavuzlar şu parametreleri önermektedir:</w:t>
+      </w:r>
+    </w:p>
+    <w:p>
+      <w:pPr>
+        <w:spacing w:line="360" w:lineRule="auto" w:after="0" w:before="0"/>
+        <w:ind w:firstLine="0" w:left="0" w:right="0"/>
+        <w:jc w:val="both"/>
+        <w:rPr>
+          <w:b/>
+          <w:bCs/>
+          <w:lang/>
+        </w:rPr>
+      </w:pPr>
+      <w:r>
+        <w:rPr>
+          <w:rFonts w:ascii="Times New Roman" w:hAnsi="Times New Roman" w:cs="Times New Roman" w:eastAsia="Times New Roman"/>
+          <w:b w:val="0"/>
+          <w:bCs/>
+          <w:i w:val="0"/>
+          <w:sz w:val="22"/>
+          <w:u w:val="none"/>
+          <w:lang/>
+        </w:rPr>
+        <w:t>Permisif Hiperkapni ve Solunum Hızı Titrasyonu</w:t>
+      </w:r>
+    </w:p>
+    <w:p>
+      <w:pPr>
+        <w:spacing w:line="360" w:lineRule="auto" w:after="0" w:before="0"/>
+        <w:ind w:firstLine="0" w:left="0" w:right="0"/>
+        <w:jc w:val="both"/>
+        <w:rPr>
+          <w:lang/>
+        </w:rPr>
+      </w:pPr>
+      <w:r>
+        <w:rPr>
+          <w:rFonts w:ascii="Times New Roman" w:hAnsi="Times New Roman" w:cs="Times New Roman" w:eastAsia="Times New Roman"/>
+          <w:b w:val="0"/>
+          <w:i w:val="0"/>
+          <w:sz w:val="22"/>
+          <w:u w:val="none"/>
+          <w:lang/>
+        </w:rPr>
+        <w:t>CO2​ eliminasyonunu sağlamak için solunum hızı (frekans) artırılmalıdır. Ancak hızın aşırı artırılması ekspiryum süresini kısaltarak oto-PEEP (intrensek PEEP) oluşumuna ve venöz dönüşün daha da bozulmasına yol açar. Bu nedenle güncel kılavuzlar, arteriyel pH&gt;7.25 ve EtCO2​&lt;50−55 mmHg arasında tutulacak şekilde ılımlı bir permisif hiperkapniye izin verilmesini önermektedir.</w:t>
+      </w:r>
+    </w:p>
+    <w:p>
+      <w:pPr>
+        <w:spacing w:line="360" w:lineRule="auto" w:after="0" w:before="0"/>
+        <w:ind w:firstLine="0" w:left="0" w:right="0"/>
+        <w:jc w:val="both"/>
+        <w:rPr>
+          <w:b/>
+          <w:bCs/>
+          <w:lang/>
+        </w:rPr>
+      </w:pPr>
+      <w:r>
+        <w:rPr>
+          <w:rFonts w:ascii="Times New Roman" w:hAnsi="Times New Roman" w:cs="Times New Roman" w:eastAsia="Times New Roman"/>
+          <w:b w:val="0"/>
+          <w:bCs/>
+          <w:i w:val="0"/>
+          <w:sz w:val="22"/>
+          <w:u w:val="none"/>
+          <w:lang/>
+        </w:rPr>
+        <w:t>3. Kritik Güncel Güncelleme: Hedefe Yönelik Sıvı Tedavisi (GDFT)</w:t>
+      </w:r>
+    </w:p>
+    <w:p>
+      <w:pPr>
+        <w:spacing w:line="360" w:lineRule="auto" w:after="0" w:before="0"/>
+        <w:ind w:firstLine="0" w:left="0" w:right="0"/>
+        <w:jc w:val="both"/>
+        <w:rPr>
+          <w:lang/>
+        </w:rPr>
+      </w:pPr>
+      <w:r>
+        <w:rPr>
+          <w:rFonts w:ascii="Times New Roman" w:hAnsi="Times New Roman" w:cs="Times New Roman" w:eastAsia="Times New Roman"/>
+          <w:b w:val="0"/>
+          <w:i w:val="0"/>
+          <w:sz w:val="22"/>
+          <w:u w:val="none"/>
+          <w:lang/>
+        </w:rPr>
+        <w:t>Modern perioperatif yönetimde gözden kaçırılmaması gereken en önemli nokta sıvı kısıtlamasıdır. Kapnotoraksın yarattığı preload azalmasına bağlı hipotansiyonu düzeltmek için hastaya agresif hidrasyon (kristaloid yüklemesi) uygulamak güncel pratikte tamamen terk edilmiştir.</w:t>
+      </w:r>
+    </w:p>
+    <w:p>
+      <w:pPr>
+        <w:spacing w:line="360" w:lineRule="auto" w:after="0" w:before="0"/>
+        <w:ind w:firstLine="0" w:left="0" w:right="0"/>
+        <w:jc w:val="both"/>
+        <w:rPr>
+          <w:lang/>
+        </w:rPr>
+      </w:pPr>
+      <w:r>
+        <w:rPr>
+          <w:rFonts w:ascii="Times New Roman" w:hAnsi="Times New Roman" w:cs="Times New Roman" w:eastAsia="Times New Roman"/>
+          <w:b w:val="0"/>
+          <w:bCs/>
+          <w:i w:val="0"/>
+          <w:sz w:val="22"/>
+          <w:u w:val="none"/>
+          <w:lang/>
+        </w:rPr>
+        <w:t>Modern Klinik Kural: Aşırı sıvı yüklemesi, zaten solunum kas rezervi sınırda olan (VC: 2.5 L) MG hastasında postoperatif dönemde interstitiyel akciğer ödemine yol açarak ekstübasyonu imkansız hale getirir. Hemodinamik dalgalanmalar sıvı yerine minimal doz vazopressörlerle (örn. efedrin veya norepinefrin infüzyonu) yönetilmeli, sıvı yönetimi Stroke Volüm Varyasyonu (SVV) gibi dinamik parametrelerle hedefe yönelik (GDFT) planlanmalıdır.</w:t>
+      </w:r>
+    </w:p>
+    <w:p>
+      <w:pPr>
+        <w:spacing w:line="360" w:lineRule="auto" w:after="0" w:before="0"/>
         <w:ind w:left="0" w:firstLine="0" w:right="0"/>
         <w:jc w:val="both"/>
         <w:rPr>
@@ -4169,12 +4594,12 @@
           <w:u w:val="none"/>
           <w:lang/>
         </w:rPr>
-        <w:t>Miller's Anesthesia (9th Edition, 2020) - Chapter 39: Anesthesia for Patients with Neuromuscular Disease &amp; Chapter 69: Anesthesia for Thoracic Surgery. (Volatil anesteziklerin postsinaptik nikotinik reseptörler üzerindeki inhibitör mekanizmalarını, kas gevşeticilerle olan sinerjistik etkileşimlerini ve TİVA'nın nöromüsküler monitörizasyondaki prediktif avantajlarını sunan temel textbook referansıdır.)</w:t>
-      </w:r>
-    </w:p>
-    <w:p>
-      <w:pPr>
-        <w:spacing w:after="0" w:line="360" w:lineRule="auto" w:before="0"/>
+        <w:t>ERAS® Society Guidelines for Perioperative Care in Thoracic Surgery (2024/2025 Updates): Robotik torasik cerrahilerde akciğer koruyucu ventilasyon limitleri, minimal sıvı stratejileri ve erken ekstübasyon protokollerinin standardizasyonu.</w:t>
+      </w:r>
+    </w:p>
+    <w:p>
+      <w:pPr>
+        <w:spacing w:line="360" w:lineRule="auto" w:after="0" w:before="0"/>
         <w:ind w:left="0" w:firstLine="0" w:right="0"/>
         <w:jc w:val="both"/>
         <w:rPr>
@@ -4191,12 +4616,12 @@
           <w:u w:val="none"/>
           <w:lang/>
         </w:rPr>
-        <w:t>Blichfeldt-Lauridsen, L., &amp; Hansen, B. D. (2012). Anesthesia and myasthenia gravis. Acta Anaesthesiologica Scandinavica, 56(10), 1215-1225. (Sevofluran ve desfluranın MG olgularında NMB gereksinimini ne oranda azalttığını ve TİVA kombinasyonlarının erken ekstübasyon süreleri üzerindeki klinik karşılaştırmalarını içeren rehber makaledir.)</w:t>
-      </w:r>
-    </w:p>
-    <w:p>
-      <w:pPr>
-        <w:spacing w:after="0" w:line="360" w:lineRule="auto" w:before="0"/>
+        <w:t>Principles and Practice of Anesthesia for Thoracic Surgery (3rd Edition): Kapnotoraks patofizyolojisi, plevral CO2​ absorbsiyonu ve sürüş basıncı (ΔP) odaklı ventilatör yönetimi.</w:t>
+      </w:r>
+    </w:p>
+    <w:p>
+      <w:pPr>
+        <w:spacing w:line="360" w:lineRule="auto" w:after="0" w:before="0"/>
         <w:ind w:left="0" w:firstLine="0" w:right="0"/>
         <w:jc w:val="both"/>
         <w:rPr>
@@ -4213,7 +4638,7 @@
           <w:u w:val="none"/>
           <w:lang/>
         </w:rPr>
-        <w:t>Anestezi Pratiğinde Nöromüsküler Hastalıklara Yaklaşım Kılavuzları (Torasik ve Robotik Cerrahi Serisi).(Robotik timektomilerde hareketsizliğin önemi ile MG patofizyolojisindeki postoperatif solunum yetmezliği risklerinin yönetiminde anestezi idame ajanlarının titrasyon protokollerini içeren klinik kaynağımızdır.)</w:t>
+        <w:t>Current International Consensus Guidance for the Management of Myasthenia Gravis: Kas gücü sınırda olan olgularda perioperatif respiratuar ve hemodinamik optimizasyon kriterleri.</w:t>
       </w:r>
     </w:p>
     <w:p>
@@ -4239,7 +4664,7 @@
           <w:u w:val="none"/>
           <w:lang/>
         </w:rPr>
-        <w:t>Soru 8 (Robotik Cerrahi Fizyolojisi): Robotik timektomi sırasında uygulanacak CO2​ insüflasyonunun (kapnotoraks) ve hastaya verilecek pozisyonun intratorasik basınç, akciğer kompliyansı, venöz dönüş ve genel hemodinami üzerindeki olası etkileri nelerdir? Anestezi ekibi bu fizyolojik değişiklikleri akciğer koruyucu ventilasyon parametreleriyle nasıl yönetmelidir?</w:t>
+        <w:t>Soru 9 (Monitörizasyon): Nöromüsküler fonksiyonun intraoperatif takibinde kantitatif "Train-of-Four" (TOF) monitörizasyonu neden altın standarttır? Yalnızca klinik belirtilere (örneğin solunum eforu) veya kalitatif TOF (görsel/taktil) değerlendirmesine güvenmek neden risklidir?</w:t>
       </w:r>
     </w:p>
     <w:p>
@@ -4260,7 +4685,7 @@
           <w:u w:val="none"/>
           <w:lang/>
         </w:rPr>
-        <w:t>Robotik timektomide (RATS) uygulanan yapay kapnotoraks ve cerrahi pozisyonlama, göğüs kafesi açık yapılan geleneksel cerrahilerden tamamen farklı bir fizyopatolojik tablo yaratır. Güncel ERAS (Cerrahi Sonrası Erken Derlenme) protokolleri ve modern torasik anestezi kılavuzları ışığında, bu mekanik etkileri ve akciğer koruyucu ventilasyon (AKV) yönetimini en güncel klinik yaklaşımlarla yeniden ele alalım.</w:t>
+        <w:t>Myastenia Gravis (MG) patofizyolojisinde postsinaptik nikotinik asetilkolin reseptörlerinin (nAChR) otoimmün destrüksiyonu, nöromüsküler iletimin "güvenlik marjını" (safety margin) dramatik ölçüde daraltır. Bu zemin üzerinde, minimal düzeydeki Rezidüel Nöromüsküler Blokaj (RNMB) dahi myastenik olgularda ölümcül solunumsal komplikasyonlara yol açabilir.</w:t>
       </w:r>
     </w:p>
     <w:p>
@@ -4269,6 +4694,27 @@
         <w:ind w:firstLine="0" w:left="0" w:right="0"/>
         <w:jc w:val="both"/>
         <w:rPr>
+          <w:lang/>
+        </w:rPr>
+      </w:pPr>
+      <w:r>
+        <w:rPr>
+          <w:rFonts w:ascii="Times New Roman" w:hAnsi="Times New Roman" w:cs="Times New Roman" w:eastAsia="Times New Roman"/>
+          <w:b w:val="0"/>
+          <w:i w:val="0"/>
+          <w:sz w:val="22"/>
+          <w:u w:val="none"/>
+          <w:lang/>
+        </w:rPr>
+        <w:t>Perioperatif dönemde hastanın nöromüsküler fonksiyonlarının objektif olarak değerlendirilmesi, "fast-track" ekstübasyon protokollerinin güvenliği açısından kritik önem taşır. Kantitatif monirötizasyonun altın standart olma gerekçelerini ve konvansiyonel yöntemlerin taşıdığı riskleri akademik düzeyde şu başlıklar altında inceleyebiliriz:</w:t>
+      </w:r>
+    </w:p>
+    <w:p>
+      <w:pPr>
+        <w:spacing w:line="360" w:lineRule="auto" w:after="0" w:before="0"/>
+        <w:ind w:firstLine="0" w:left="0" w:right="0"/>
+        <w:jc w:val="both"/>
+        <w:rPr>
           <w:b/>
           <w:bCs/>
           <w:lang/>
@@ -4284,7 +4730,7 @@
           <w:u w:val="none"/>
           <w:lang/>
         </w:rPr>
-        <w:t>1. Kapnotoraks ve Pozisyonun Güncel Fizyopatolojik Analizi</w:t>
+        <w:t>1. Konvansiyonel Klinik Belirtilerin Yetersizliği ve Fizyolojik Tuzaklar</w:t>
       </w:r>
     </w:p>
     <w:p>
@@ -4305,7 +4751,7 @@
           <w:u w:val="none"/>
           <w:lang/>
         </w:rPr>
-        <w:t>Modern cerrahide plevral boşluğa uygulanan CO2​ insüflasyonu (8−12 mmHg) ve hastaya verilen yarı lateral/reverse Trendelenburg pozisyonu iki temel cephede meydan okuma yaratır:</w:t>
+        <w:t>Geleneksel anestezi pratiğinde yaygın olarak kullanılan "5 saniye süreyle başı yataktan kaldırabilme", "yeterli tidal volüm üretebilme", "etkin öksürük refleksi" ve "dil basacağına karşı güçlü ısırma" gibi yatak başı klinik testler, nöromüsküler iletimin tam olarak iyileştiğini kanıtlamada yetersiz ve duyarsız duyarlılığa sahiptir.</w:t>
       </w:r>
     </w:p>
     <w:p>
@@ -4314,6 +4760,50 @@
         <w:ind w:firstLine="0" w:left="0" w:right="0"/>
         <w:jc w:val="both"/>
         <w:rPr>
+          <w:lang/>
+        </w:rPr>
+      </w:pPr>
+      <w:r>
+        <w:rPr>
+          <w:rFonts w:ascii="Times New Roman" w:hAnsi="Times New Roman" w:cs="Times New Roman" w:eastAsia="Times New Roman"/>
+          <w:b w:val="0"/>
+          <w:bCs/>
+          <w:i w:val="0"/>
+          <w:sz w:val="22"/>
+          <w:u w:val="none"/>
+          <w:lang/>
+        </w:rPr>
+        <w:t>Diferansiyel Kas Hassasiyeti: Nöromüsküler blokerlerin (NMB) farklı kas grupları üzerindeki farmakodinamik etkileri heterojendir. Diyafram kası, non-depolarizan NMB ajanlarına karşı en dirençli ve en hızlı iyileşen kas grubudur. Buna karşın, üst hava yolunun açıklığını ve patentliğini sağlayan farengeal konstrüktör kaslar ile geniyoglosus kası, NMB ajanlarına karşı son derece hassastır ve en geç derlenen fonksiyonlardır.</w:t>
+      </w:r>
+    </w:p>
+    <w:p>
+      <w:pPr>
+        <w:spacing w:line="360" w:lineRule="auto" w:after="0" w:before="0"/>
+        <w:ind w:firstLine="0" w:left="0" w:right="0"/>
+        <w:jc w:val="both"/>
+        <w:rPr>
+          <w:lang/>
+        </w:rPr>
+      </w:pPr>
+      <w:r>
+        <w:rPr>
+          <w:rFonts w:ascii="Times New Roman" w:hAnsi="Times New Roman" w:cs="Times New Roman" w:eastAsia="Times New Roman"/>
+          <w:b w:val="0"/>
+          <w:bCs/>
+          <w:i w:val="0"/>
+          <w:sz w:val="22"/>
+          <w:u w:val="none"/>
+          <w:lang/>
+        </w:rPr>
+        <w:t>Gizli Felç (Klinik Maskeleme): Hasta, Train-of-Four (TOF) oranı (T4​/T1​) henüz 0.50 - 0.60 seviyesindeyken dahi diyafram gücü sayesinde 5 saniye baş kaldırma testini başarıyla gerçekleştirebilir veya yeterli spontan tidal volüm üretebilir. Ancak bu esnada farengeal kaslardaki parsiyel paralizi devam etmektedir. Bu dönemde yapılacak bir ekstübasyon; üst hava yolu kollapsına, koruyucu larengeal reflekslerin kaybına, mikro-aspirasyonlara ve akut postoperatif solunum yetmezliğine zemin hazırlar.</w:t>
+      </w:r>
+    </w:p>
+    <w:p>
+      <w:pPr>
+        <w:spacing w:line="360" w:lineRule="auto" w:after="0" w:before="0"/>
+        <w:ind w:firstLine="0" w:left="0" w:right="0"/>
+        <w:jc w:val="both"/>
+        <w:rPr>
           <w:b/>
           <w:bCs/>
           <w:lang/>
@@ -4329,7 +4819,7 @@
           <w:u w:val="none"/>
           <w:lang/>
         </w:rPr>
-        <w:t>Solunum Mekanikleri Üzerindeki Baskı</w:t>
+        <w:t>2. Kalitatif (Görsel ve Taktil) TOF Değerlendirmesinin Subjektif Sınırları</w:t>
       </w:r>
     </w:p>
     <w:p>
@@ -4345,13 +4835,12 @@
         <w:rPr>
           <w:rFonts w:ascii="Times New Roman" w:hAnsi="Times New Roman" w:cs="Times New Roman" w:eastAsia="Times New Roman"/>
           <w:b w:val="0"/>
-          <w:bCs/>
-          <w:i w:val="0"/>
-          <w:sz w:val="22"/>
-          <w:u w:val="none"/>
-          <w:lang/>
-        </w:rPr>
-        <w:t>Atelektazi ve Şant: Yüksek intratorasik basınç, bağımlı akciğer alanlarında mikro-atelektazilere yol açarak ventilasyon/perfüzyon (V/Q) uyumsuzluğunu derinleştirir. Akciğer kompliyansı %30 ila %40 oranında azalır.</w:t>
+          <w:i w:val="0"/>
+          <w:sz w:val="22"/>
+          <w:u w:val="none"/>
+          <w:lang/>
+        </w:rPr>
+        <w:t>Periferik sinir stimülatörü ile nervus ulnaris uyarımı sonrası musculus adductor pollicis kasılması veya nervus facialisuyarımı sonrası musculus orbicularis oculi yanıtının el yordamıyla (taktil) hissedilmesi veya gözle (görsel) izlenmesi, tamamen klinisyenin duyusal eşik sınırlarına bağlı sübjektif bir yöntemdir.</w:t>
       </w:r>
     </w:p>
     <w:p>
@@ -4373,7 +4862,7 @@
           <w:u w:val="none"/>
           <w:lang/>
         </w:rPr>
-        <w:t>Hiperkapni ve Asidoz: Plevra yüzeyinden sürekli absorbe olan CO2​, sistemik solunumsal asidoza neden olur. Asidoz ise Myastenia Gravis hastalarında nöromüsküler iletim blokajını potansiyalize edebileceği için yakından yönetilmelidir.</w:t>
+        <w:t>İnsan Duyusunun Sınırı (The Blind Spot): Literatür verileri, insan elinin veya gözünün, ardışık dört uyarı arasındaki amplitüd azalmasını (fade/solma fenomenini) ayırt etme yeteneğinin sınırlı olduğunu kesin olarak göstermiştir. TOF oranı 0.40'ın üzerine çıktığında, taktil veya görsel olarak "fade" algılanması neredeyse imkansız hale gelir.</w:t>
       </w:r>
     </w:p>
     <w:p>
@@ -4382,6 +4871,28 @@
         <w:ind w:firstLine="0" w:left="0" w:right="0"/>
         <w:jc w:val="both"/>
         <w:rPr>
+          <w:lang/>
+        </w:rPr>
+      </w:pPr>
+      <w:r>
+        <w:rPr>
+          <w:rFonts w:ascii="Times New Roman" w:hAnsi="Times New Roman" w:cs="Times New Roman" w:eastAsia="Times New Roman"/>
+          <w:b w:val="0"/>
+          <w:bCs/>
+          <w:i w:val="0"/>
+          <w:sz w:val="22"/>
+          <w:u w:val="none"/>
+          <w:lang/>
+        </w:rPr>
+        <w:t>Yalancı Güven hissi: Klinisyen, dört mekanik kasılmayı da "eşit ve güçlü" olarak algılayabilir (kalitatif olarak 4/4 yanıt). Ancak bu esnada hastanın objektif TOF oranı 0.60 - 0.70 civarında olabilir. Özellikle güvenlik marjı ortadan kalkmış olan bu MG hastasında (bazal vital kapasitesi 2.5 L), 0.70'lik bir TOF oranı kritik solunumsal dekompensasyonu tetiklemek için yeterlidir.</w:t>
+      </w:r>
+    </w:p>
+    <w:p>
+      <w:pPr>
+        <w:spacing w:line="360" w:lineRule="auto" w:after="0" w:before="0"/>
+        <w:ind w:firstLine="0" w:left="0" w:right="0"/>
+        <w:jc w:val="both"/>
+        <w:rPr>
           <w:b/>
           <w:bCs/>
           <w:lang/>
@@ -4397,7 +4908,7 @@
           <w:u w:val="none"/>
           <w:lang/>
         </w:rPr>
-        <w:t>Hemodinamik Etkiler (Preload ve Afterload Çatışması)</w:t>
+        <w:t>3. Kantitatif TOF Monitörizasyonunun Bilimsel Rasyoneli</w:t>
       </w:r>
     </w:p>
     <w:p>
@@ -4413,13 +4924,12 @@
         <w:rPr>
           <w:rFonts w:ascii="Times New Roman" w:hAnsi="Times New Roman" w:cs="Times New Roman" w:eastAsia="Times New Roman"/>
           <w:b w:val="0"/>
-          <w:bCs/>
-          <w:i w:val="0"/>
-          <w:sz w:val="22"/>
-          <w:u w:val="none"/>
-          <w:lang/>
-        </w:rPr>
-        <w:t>Kardiyak Output Düşüşü: Göğüs içi basıncın artması vena cava üstündeki mekanik basıyı artırarak venöz dönüşü (preload) azaltır. Eş zamanlı olarak hipoksi ve hiperkapniye bağlı pulmoner vazokonstrüksiyon, sağ ventrikül art yükünü (afterload) yükseltir.</w:t>
+          <w:i w:val="0"/>
+          <w:sz w:val="22"/>
+          <w:u w:val="none"/>
+          <w:lang/>
+        </w:rPr>
+        <w:t>Kantitatif (objektif) monitörizasyon; akseleromiyografi (AMG), elektromiyografi (EMG) veya kinemiyografi (KMG) gibi fiziksel/elektriksel ölçüm modalitelerini kullanarak dördüncü kasılma yanıtının ilk kasılma yanıtına olan oranını (T4​/T1​) net bir matematiksel değer olarak ekrana yansıtır.</w:t>
       </w:r>
     </w:p>
     <w:p>
@@ -4441,7 +4951,7 @@
           <w:u w:val="none"/>
           <w:lang/>
         </w:rPr>
-        <w:t>Sempatik Aktivasyon: Absorbe olan gazın yarattığı hiperkapni sempatik sistemi uyararak maskelenmiş bir hipertansiyon ve taşikardi tablosu yaratabilir; bu durum gerçek hacim statüsünü (hipovolemiyi) gizleyebilir.</w:t>
+        <w:t>Güvenli Ekstübasyon Eşiği: Modern uluslararası anestezi kılavuzları, postoperatif pulmoner komplikasyon riskini en aza indirmek için objektif TOF oranının ≥ 0.90 (%90) olmasını zorunlu kılmaktadır. Myastenia Gravis gibi nöromüsküler iletim bozukluğu olan patolojilerde ise üst hava yolu reflekslerinin tam güvenliği için bu eşik değerin &gt; 0.95 (%95) seviyesinde görülmesi istenir.</w:t>
       </w:r>
     </w:p>
     <w:p>
@@ -4450,22 +4960,20 @@
         <w:ind w:firstLine="0" w:left="0" w:right="0"/>
         <w:jc w:val="both"/>
         <w:rPr>
-          <w:b/>
-          <w:bCs/>
-          <w:lang/>
-        </w:rPr>
-      </w:pPr>
-      <w:r>
-        <w:rPr>
-          <w:rFonts w:ascii="Times New Roman" w:hAnsi="Times New Roman" w:cs="Times New Roman" w:eastAsia="Times New Roman"/>
-          <w:b w:val="0"/>
-          <w:bCs/>
-          <w:i w:val="0"/>
-          <w:sz w:val="22"/>
-          <w:u w:val="none"/>
-          <w:lang/>
-        </w:rPr>
-        <w:t>2. Güncel Akciğer Koruyucu Ventilasyon (AKV) Stratejisi</w:t>
+          <w:lang/>
+        </w:rPr>
+      </w:pPr>
+      <w:r>
+        <w:rPr>
+          <w:rFonts w:ascii="Times New Roman" w:hAnsi="Times New Roman" w:cs="Times New Roman" w:eastAsia="Times New Roman"/>
+          <w:b w:val="0"/>
+          <w:bCs/>
+          <w:i w:val="0"/>
+          <w:sz w:val="22"/>
+          <w:u w:val="none"/>
+          <w:lang/>
+        </w:rPr>
+        <w:t>Gri Bölgenin Görünür Kılınması: Kantitatif monitörizasyon, kalitatif yöntemlerin kör noktası olan %40 ile %90 arasındaki tehlikeli rezidüel blokaj evresini kesin ve hassas bir şekilde ölçebilen yegane yöntemdir.</w:t>
       </w:r>
     </w:p>
     <w:p>
@@ -4481,124 +4989,13 @@
         <w:rPr>
           <w:rFonts w:ascii="Times New Roman" w:hAnsi="Times New Roman" w:cs="Times New Roman" w:eastAsia="Times New Roman"/>
           <w:b w:val="0"/>
-          <w:i w:val="0"/>
-          <w:sz w:val="22"/>
-          <w:u w:val="none"/>
-          <w:lang/>
-        </w:rPr>
-        <w:t>Hastamızın bazal vital kapasitesinin 2.5 L olduğunu düşündüğümüzde, ameliyat sonu hızlı ekstübasyon (fast-track) başarısı tamamen intraoperatif ventilatör stratejisine bağlıdır. Güncel kılavuzlar şu parametreleri önermektedir:</w:t>
-      </w:r>
-    </w:p>
-    <w:p>
-      <w:pPr>
-        <w:spacing w:line="360" w:lineRule="auto" w:after="0" w:before="0"/>
-        <w:ind w:firstLine="0" w:left="0" w:right="0"/>
-        <w:jc w:val="both"/>
-        <w:rPr>
-          <w:b/>
-          <w:bCs/>
-          <w:lang/>
-        </w:rPr>
-      </w:pPr>
-      <w:r>
-        <w:rPr>
-          <w:rFonts w:ascii="Times New Roman" w:hAnsi="Times New Roman" w:cs="Times New Roman" w:eastAsia="Times New Roman"/>
-          <w:b w:val="0"/>
-          <w:bCs/>
-          <w:i w:val="0"/>
-          <w:sz w:val="22"/>
-          <w:u w:val="none"/>
-          <w:lang/>
-        </w:rPr>
-        <w:t>Permisif Hiperkapni ve Solunum Hızı Titrasyonu</w:t>
-      </w:r>
-    </w:p>
-    <w:p>
-      <w:pPr>
-        <w:spacing w:line="360" w:lineRule="auto" w:after="0" w:before="0"/>
-        <w:ind w:firstLine="0" w:left="0" w:right="0"/>
-        <w:jc w:val="both"/>
-        <w:rPr>
-          <w:lang/>
-        </w:rPr>
-      </w:pPr>
-      <w:r>
-        <w:rPr>
-          <w:rFonts w:ascii="Times New Roman" w:hAnsi="Times New Roman" w:cs="Times New Roman" w:eastAsia="Times New Roman"/>
-          <w:b w:val="0"/>
-          <w:i w:val="0"/>
-          <w:sz w:val="22"/>
-          <w:u w:val="none"/>
-          <w:lang/>
-        </w:rPr>
-        <w:t>CO2​ eliminasyonunu sağlamak için solunum hızı (frekans) artırılmalıdır. Ancak hızın aşırı artırılması ekspiryum süresini kısaltarak oto-PEEP (intrensek PEEP) oluşumuna ve venöz dönüşün daha da bozulmasına yol açar. Bu nedenle güncel kılavuzlar, arteriyel pH&gt;7.25 ve EtCO2​&lt;50−55 mmHg arasında tutulacak şekilde ılımlı bir permisif hiperkapniye izin verilmesini önermektedir.</w:t>
-      </w:r>
-    </w:p>
-    <w:p>
-      <w:pPr>
-        <w:spacing w:line="360" w:lineRule="auto" w:after="0" w:before="0"/>
-        <w:ind w:firstLine="0" w:left="0" w:right="0"/>
-        <w:jc w:val="both"/>
-        <w:rPr>
-          <w:b/>
-          <w:bCs/>
-          <w:lang/>
-        </w:rPr>
-      </w:pPr>
-      <w:r>
-        <w:rPr>
-          <w:rFonts w:ascii="Times New Roman" w:hAnsi="Times New Roman" w:cs="Times New Roman" w:eastAsia="Times New Roman"/>
-          <w:b w:val="0"/>
-          <w:bCs/>
-          <w:i w:val="0"/>
-          <w:sz w:val="22"/>
-          <w:u w:val="none"/>
-          <w:lang/>
-        </w:rPr>
-        <w:t>3. Kritik Güncel Güncelleme: Hedefe Yönelik Sıvı Tedavisi (GDFT)</w:t>
-      </w:r>
-    </w:p>
-    <w:p>
-      <w:pPr>
-        <w:spacing w:line="360" w:lineRule="auto" w:after="0" w:before="0"/>
-        <w:ind w:firstLine="0" w:left="0" w:right="0"/>
-        <w:jc w:val="both"/>
-        <w:rPr>
-          <w:lang/>
-        </w:rPr>
-      </w:pPr>
-      <w:r>
-        <w:rPr>
-          <w:rFonts w:ascii="Times New Roman" w:hAnsi="Times New Roman" w:cs="Times New Roman" w:eastAsia="Times New Roman"/>
-          <w:b w:val="0"/>
-          <w:i w:val="0"/>
-          <w:sz w:val="22"/>
-          <w:u w:val="none"/>
-          <w:lang/>
-        </w:rPr>
-        <w:t>Modern perioperatif yönetimde gözden kaçırılmaması gereken en önemli nokta sıvı kısıtlamasıdır. Kapnotoraksın yarattığı preload azalmasına bağlı hipotansiyonu düzeltmek için hastaya agresif hidrasyon (kristaloid yüklemesi) uygulamak güncel pratikte tamamen terk edilmiştir.</w:t>
-      </w:r>
-    </w:p>
-    <w:p>
-      <w:pPr>
-        <w:spacing w:line="360" w:lineRule="auto" w:after="0" w:before="0"/>
-        <w:ind w:firstLine="0" w:left="0" w:right="0"/>
-        <w:jc w:val="both"/>
-        <w:rPr>
-          <w:lang/>
-        </w:rPr>
-      </w:pPr>
-      <w:r>
-        <w:rPr>
-          <w:rFonts w:ascii="Times New Roman" w:hAnsi="Times New Roman" w:cs="Times New Roman" w:eastAsia="Times New Roman"/>
-          <w:b w:val="0"/>
-          <w:bCs/>
-          <w:i w:val="0"/>
-          <w:sz w:val="22"/>
-          <w:u w:val="none"/>
-          <w:lang/>
-        </w:rPr>
-        <w:t>Modern Klinik Kural: Aşırı sıvı yüklemesi, zaten solunum kas rezervi sınırda olan (VC: 2.5 L) MG hastasında postoperatif dönemde interstitiyel akciğer ödemine yol açarak ekstübasyonu imkansız hale getirir. Hemodinamik dalgalanmalar sıvı yerine minimal doz vazopressörlerle (örn. efedrin veya norepinefrin infüzyonu) yönetilmeli, sıvı yönetimi Stroke Volüm Varyasyonu (SVV) gibi dinamik parametrelerle hedefe yönelik (GDFT) planlanmalıdır.</w:t>
+          <w:bCs/>
+          <w:i w:val="0"/>
+          <w:sz w:val="22"/>
+          <w:u w:val="none"/>
+          <w:lang/>
+        </w:rPr>
+        <w:t>Akademik Konsensüs Özeti: Robotik timektomi planlanan ve solunum rezervi sınırda seyreden (VC:2,5 L) Myastenia Gravis hastasında, intraoperatif dönemde non-depolarizan blok derinliğini izlemek ve ameliyat sonunda güvenli ekstübasyon kararı vermek için kantitatif TOF monitörizasyonu elektif bir seçenek değil, perioperatif hasta güvenliğinin yasal ve tıbbi bir zorunluluğudur. Cihaz ekranında sayısal olarak %95 derlenme görülmeden yapılacak her ekstübasyon girişimi, hastayı doğrudan postoperatif mekanik ventilasyon ihtiyacına sürükler.</w:t>
       </w:r>
     </w:p>
     <w:p>
@@ -4620,7 +5017,7 @@
           <w:u w:val="none"/>
           <w:lang/>
         </w:rPr>
-        <w:t>ERAS® Society Guidelines for Perioperative Care in Thoracic Surgery (2024/2025 Updates): Robotik torasik cerrahilerde akciğer koruyucu ventilasyon limitleri, minimal sıvı stratejileri ve erken ekstübasyon protokollerinin standardizasyonu.</w:t>
+        <w:t xml:space="preserve">Thilen, S. R., Weigel, W. A., Todd, M. M., et al. (2023). 2023 American Society of Anesthesiologists Practice Guidelines for Monitoring and Antagonism of Neuromuscular Blockade: A Report by the American Society of Anesthesiologists Task Force on Neuromuscular Blockade. Anesthesiology, 138(1), 13-41. </w:t>
       </w:r>
     </w:p>
     <w:p>
@@ -4642,7 +5039,7 @@
           <w:u w:val="none"/>
           <w:lang/>
         </w:rPr>
-        <w:t>Principles and Practice of Anesthesia for Thoracic Surgery (3rd Edition): Kapnotoraks patofizyolojisi, plevral CO2​ absorbsiyonu ve sürüş basıncı (ΔP) odaklı ventilatör yönetimi.</w:t>
+        <w:t>Blichfeldt-Lauridsen, L., &amp; Hansen, B. D. (2012). Anesthesia and myasthenia gravis. Acta Anaesthesiologica Scandinavica, 56(10), 1215-1225</w:t>
       </w:r>
     </w:p>
     <w:p>
@@ -4664,364 +5061,7 @@
           <w:u w:val="none"/>
           <w:lang/>
         </w:rPr>
-        <w:t>Current International Consensus Guidance for the Management of Myasthenia Gravis: Kas gücü sınırda olan olgularda perioperatif respiratuar ve hemodinamik optimizasyon kriterleri.</w:t>
-      </w:r>
-    </w:p>
-    <w:p>
-      <w:pPr>
-        <w:spacing w:after="120" w:line="360" w:lineRule="auto" w:before="0"/>
-        <w:ind w:firstLine="0" w:left="0" w:right="0"/>
-        <w:jc w:val="left"/>
-        <w:rPr>
-          <w:b/>
-          <w:bCs/>
-          <w:i/>
-          <w:iCs/>
-          <w:lang/>
-        </w:rPr>
-      </w:pPr>
-      <w:r>
-        <w:rPr>
-          <w:rFonts w:ascii="Times New Roman" w:hAnsi="Times New Roman" w:cs="Times New Roman" w:eastAsia="Times New Roman"/>
-          <w:b/>
-          <w:bCs/>
-          <w:i w:val="0"/>
-          <w:sz w:val="24"/>
-          <w:u w:val="none"/>
-          <w:lang/>
-        </w:rPr>
-        <w:t>Soru 9 (Monitörizasyon): Nöromüsküler fonksiyonun intraoperatif takibinde kantitatif "Train-of-Four" (TOF) monitörizasyonu neden altın standarttır? Yalnızca klinik belirtilere (örneğin solunum eforu) veya kalitatif TOF (görsel/taktil) değerlendirmesine güvenmek neden risklidir?</w:t>
-      </w:r>
-    </w:p>
-    <w:p>
-      <w:pPr>
-        <w:spacing w:line="360" w:lineRule="auto" w:after="0" w:before="0"/>
-        <w:ind w:firstLine="0" w:left="0" w:right="0"/>
-        <w:jc w:val="both"/>
-        <w:rPr>
-          <w:lang/>
-        </w:rPr>
-      </w:pPr>
-      <w:r>
-        <w:rPr>
-          <w:rFonts w:ascii="Times New Roman" w:hAnsi="Times New Roman" w:cs="Times New Roman" w:eastAsia="Times New Roman"/>
-          <w:b w:val="0"/>
-          <w:i w:val="0"/>
-          <w:sz w:val="22"/>
-          <w:u w:val="none"/>
-          <w:lang/>
-        </w:rPr>
-        <w:t>Myastenia Gravis (MG) patofizyolojisinde postsinaptik nikotinik asetilkolin reseptörlerinin (nAChR) otoimmün destrüksiyonu, nöromüsküler iletimin "güvenlik marjını" (safety margin) dramatik ölçüde daraltır. Bu zemin üzerinde, minimal düzeydeki Rezidüel Nöromüsküler Blokaj (RNMB) dahi myastenik olgularda ölümcül solunumsal komplikasyonlara yol açabilir.</w:t>
-      </w:r>
-    </w:p>
-    <w:p>
-      <w:pPr>
-        <w:spacing w:line="360" w:lineRule="auto" w:after="0" w:before="0"/>
-        <w:ind w:firstLine="0" w:left="0" w:right="0"/>
-        <w:jc w:val="both"/>
-        <w:rPr>
-          <w:lang/>
-        </w:rPr>
-      </w:pPr>
-      <w:r>
-        <w:rPr>
-          <w:rFonts w:ascii="Times New Roman" w:hAnsi="Times New Roman" w:cs="Times New Roman" w:eastAsia="Times New Roman"/>
-          <w:b w:val="0"/>
-          <w:i w:val="0"/>
-          <w:sz w:val="22"/>
-          <w:u w:val="none"/>
-          <w:lang/>
-        </w:rPr>
-        <w:t>Perioperatif dönemde hastanın nöromüsküler fonksiyonlarının objektif olarak değerlendirilmesi, "fast-track" ekstübasyon protokollerinin güvenliği açısından kritik önem taşır. Kantitatif monirötizasyonun altın standart olma gerekçelerini ve konvansiyonel yöntemlerin taşıdığı riskleri akademik düzeyde şu başlıklar altında inceleyebiliriz:</w:t>
-      </w:r>
-    </w:p>
-    <w:p>
-      <w:pPr>
-        <w:spacing w:line="360" w:lineRule="auto" w:after="0" w:before="0"/>
-        <w:ind w:firstLine="0" w:left="0" w:right="0"/>
-        <w:jc w:val="both"/>
-        <w:rPr>
-          <w:b/>
-          <w:bCs/>
-          <w:lang/>
-        </w:rPr>
-      </w:pPr>
-      <w:r>
-        <w:rPr>
-          <w:rFonts w:ascii="Times New Roman" w:hAnsi="Times New Roman" w:cs="Times New Roman" w:eastAsia="Times New Roman"/>
-          <w:b w:val="0"/>
-          <w:bCs/>
-          <w:i w:val="0"/>
-          <w:sz w:val="22"/>
-          <w:u w:val="none"/>
-          <w:lang/>
-        </w:rPr>
-        <w:t>1. Konvansiyonel Klinik Belirtilerin Yetersizliği ve Fizyolojik Tuzaklar</w:t>
-      </w:r>
-    </w:p>
-    <w:p>
-      <w:pPr>
-        <w:spacing w:line="360" w:lineRule="auto" w:after="0" w:before="0"/>
-        <w:ind w:firstLine="0" w:left="0" w:right="0"/>
-        <w:jc w:val="both"/>
-        <w:rPr>
-          <w:lang/>
-        </w:rPr>
-      </w:pPr>
-      <w:r>
-        <w:rPr>
-          <w:rFonts w:ascii="Times New Roman" w:hAnsi="Times New Roman" w:cs="Times New Roman" w:eastAsia="Times New Roman"/>
-          <w:b w:val="0"/>
-          <w:i w:val="0"/>
-          <w:sz w:val="22"/>
-          <w:u w:val="none"/>
-          <w:lang/>
-        </w:rPr>
-        <w:t>Geleneksel anestezi pratiğinde yaygın olarak kullanılan "5 saniye süreyle başı yataktan kaldırabilme", "yeterli tidal volüm üretebilme", "etkin öksürük refleksi" ve "dil basacağına karşı güçlü ısırma" gibi yatak başı klinik testler, nöromüsküler iletimin tam olarak iyileştiğini kanıtlamada yetersiz ve duyarsız duyarlılığa sahiptir.</w:t>
-      </w:r>
-    </w:p>
-    <w:p>
-      <w:pPr>
-        <w:spacing w:line="360" w:lineRule="auto" w:after="0" w:before="0"/>
-        <w:ind w:firstLine="0" w:left="0" w:right="0"/>
-        <w:jc w:val="both"/>
-        <w:rPr>
-          <w:lang/>
-        </w:rPr>
-      </w:pPr>
-      <w:r>
-        <w:rPr>
-          <w:rFonts w:ascii="Times New Roman" w:hAnsi="Times New Roman" w:cs="Times New Roman" w:eastAsia="Times New Roman"/>
-          <w:b w:val="0"/>
-          <w:bCs/>
-          <w:i w:val="0"/>
-          <w:sz w:val="22"/>
-          <w:u w:val="none"/>
-          <w:lang/>
-        </w:rPr>
-        <w:t>Diferansiyel Kas Hassasiyeti: Nöromüsküler blokerlerin (NMB) farklı kas grupları üzerindeki farmakodinamik etkileri heterojendir. Diyafram kası, non-depolarizan NMB ajanlarına karşı en dirençli ve en hızlı iyileşen kas grubudur. Buna karşın, üst hava yolunun açıklığını ve patentliğini sağlayan farengeal konstrüktör kaslar ile geniyoglosus kası, NMB ajanlarına karşı son derece hassastır ve en geç derlenen fonksiyonlardır.</w:t>
-      </w:r>
-    </w:p>
-    <w:p>
-      <w:pPr>
-        <w:spacing w:line="360" w:lineRule="auto" w:after="0" w:before="0"/>
-        <w:ind w:firstLine="0" w:left="0" w:right="0"/>
-        <w:jc w:val="both"/>
-        <w:rPr>
-          <w:lang/>
-        </w:rPr>
-      </w:pPr>
-      <w:r>
-        <w:rPr>
-          <w:rFonts w:ascii="Times New Roman" w:hAnsi="Times New Roman" w:cs="Times New Roman" w:eastAsia="Times New Roman"/>
-          <w:b w:val="0"/>
-          <w:bCs/>
-          <w:i w:val="0"/>
-          <w:sz w:val="22"/>
-          <w:u w:val="none"/>
-          <w:lang/>
-        </w:rPr>
-        <w:t>Gizli Felç (Klinik Maskeleme): Hasta, Train-of-Four (TOF) oranı (T4​/T1​) henüz 0.50 - 0.60 seviyesindeyken dahi diyafram gücü sayesinde 5 saniye baş kaldırma testini başarıyla gerçekleştirebilir veya yeterli spontan tidal volüm üretebilir. Ancak bu esnada farengeal kaslardaki parsiyel paralizi devam etmektedir. Bu dönemde yapılacak bir ekstübasyon; üst hava yolu kollapsına, koruyucu larengeal reflekslerin kaybına, mikro-aspirasyonlara ve akut postoperatif solunum yetmezliğine zemin hazırlar.</w:t>
-      </w:r>
-    </w:p>
-    <w:p>
-      <w:pPr>
-        <w:spacing w:line="360" w:lineRule="auto" w:after="0" w:before="0"/>
-        <w:ind w:firstLine="0" w:left="0" w:right="0"/>
-        <w:jc w:val="both"/>
-        <w:rPr>
-          <w:b/>
-          <w:bCs/>
-          <w:lang/>
-        </w:rPr>
-      </w:pPr>
-      <w:r>
-        <w:rPr>
-          <w:rFonts w:ascii="Times New Roman" w:hAnsi="Times New Roman" w:cs="Times New Roman" w:eastAsia="Times New Roman"/>
-          <w:b w:val="0"/>
-          <w:bCs/>
-          <w:i w:val="0"/>
-          <w:sz w:val="22"/>
-          <w:u w:val="none"/>
-          <w:lang/>
-        </w:rPr>
-        <w:t>2. Kalitatif (Görsel ve Taktil) TOF Değerlendirmesinin Subjektif Sınırları</w:t>
-      </w:r>
-    </w:p>
-    <w:p>
-      <w:pPr>
-        <w:spacing w:line="360" w:lineRule="auto" w:after="0" w:before="0"/>
-        <w:ind w:firstLine="0" w:left="0" w:right="0"/>
-        <w:jc w:val="both"/>
-        <w:rPr>
-          <w:lang/>
-        </w:rPr>
-      </w:pPr>
-      <w:r>
-        <w:rPr>
-          <w:rFonts w:ascii="Times New Roman" w:hAnsi="Times New Roman" w:cs="Times New Roman" w:eastAsia="Times New Roman"/>
-          <w:b w:val="0"/>
-          <w:i w:val="0"/>
-          <w:sz w:val="22"/>
-          <w:u w:val="none"/>
-          <w:lang/>
-        </w:rPr>
-        <w:t>Periferik sinir stimülatörü ile nervus ulnaris uyarımı sonrası musculus adductor pollicis kasılması veya nervus facialisuyarımı sonrası musculus orbicularis oculi yanıtının el yordamıyla (taktil) hissedilmesi veya gözle (görsel) izlenmesi, tamamen klinisyenin duyusal eşik sınırlarına bağlı sübjektif bir yöntemdir.</w:t>
-      </w:r>
-    </w:p>
-    <w:p>
-      <w:pPr>
-        <w:spacing w:line="360" w:lineRule="auto" w:after="0" w:before="0"/>
-        <w:ind w:firstLine="0" w:left="0" w:right="0"/>
-        <w:jc w:val="both"/>
-        <w:rPr>
-          <w:lang/>
-        </w:rPr>
-      </w:pPr>
-      <w:r>
-        <w:rPr>
-          <w:rFonts w:ascii="Times New Roman" w:hAnsi="Times New Roman" w:cs="Times New Roman" w:eastAsia="Times New Roman"/>
-          <w:b w:val="0"/>
-          <w:bCs/>
-          <w:i w:val="0"/>
-          <w:sz w:val="22"/>
-          <w:u w:val="none"/>
-          <w:lang/>
-        </w:rPr>
-        <w:t>İnsan Duyusunun Sınırı (The Blind Spot): Literatür verileri, insan elinin veya gözünün, ardışık dört uyarı arasındaki amplitüd azalmasını (fade/solma fenomenini) ayırt etme yeteneğinin sınırlı olduğunu kesin olarak göstermiştir. TOF oranı 0.40'ın üzerine çıktığında, taktil veya görsel olarak "fade" algılanması neredeyse imkansız hale gelir.</w:t>
-      </w:r>
-    </w:p>
-    <w:p>
-      <w:pPr>
-        <w:spacing w:line="360" w:lineRule="auto" w:after="0" w:before="0"/>
-        <w:ind w:firstLine="0" w:left="0" w:right="0"/>
-        <w:jc w:val="both"/>
-        <w:rPr>
-          <w:lang/>
-        </w:rPr>
-      </w:pPr>
-      <w:r>
-        <w:rPr>
-          <w:rFonts w:ascii="Times New Roman" w:hAnsi="Times New Roman" w:cs="Times New Roman" w:eastAsia="Times New Roman"/>
-          <w:b w:val="0"/>
-          <w:bCs/>
-          <w:i w:val="0"/>
-          <w:sz w:val="22"/>
-          <w:u w:val="none"/>
-          <w:lang/>
-        </w:rPr>
-        <w:t>Yalancı Güven hissi: Klinisyen, dört mekanik kasılmayı da "eşit ve güçlü" olarak algılayabilir (kalitatif olarak 4/4 yanıt). Ancak bu esnada hastanın objektif TOF oranı 0.60 - 0.70 civarında olabilir. Özellikle güvenlik marjı ortadan kalkmış olan bu MG hastasında (bazal vital kapasitesi 2.5 L), 0.70'lik bir TOF oranı kritik solunumsal dekompensasyonu tetiklemek için yeterlidir.</w:t>
-      </w:r>
-    </w:p>
-    <w:p>
-      <w:pPr>
-        <w:spacing w:line="360" w:lineRule="auto" w:after="0" w:before="0"/>
-        <w:ind w:firstLine="0" w:left="0" w:right="0"/>
-        <w:jc w:val="both"/>
-        <w:rPr>
-          <w:b/>
-          <w:bCs/>
-          <w:lang/>
-        </w:rPr>
-      </w:pPr>
-      <w:r>
-        <w:rPr>
-          <w:rFonts w:ascii="Times New Roman" w:hAnsi="Times New Roman" w:cs="Times New Roman" w:eastAsia="Times New Roman"/>
-          <w:b w:val="0"/>
-          <w:bCs/>
-          <w:i w:val="0"/>
-          <w:sz w:val="22"/>
-          <w:u w:val="none"/>
-          <w:lang/>
-        </w:rPr>
-        <w:t>3. Kantitatif TOF Monitörizasyonunun Bilimsel Rasyoneli</w:t>
-      </w:r>
-    </w:p>
-    <w:p>
-      <w:pPr>
-        <w:spacing w:line="360" w:lineRule="auto" w:after="0" w:before="0"/>
-        <w:ind w:firstLine="0" w:left="0" w:right="0"/>
-        <w:jc w:val="both"/>
-        <w:rPr>
-          <w:lang/>
-        </w:rPr>
-      </w:pPr>
-      <w:r>
-        <w:rPr>
-          <w:rFonts w:ascii="Times New Roman" w:hAnsi="Times New Roman" w:cs="Times New Roman" w:eastAsia="Times New Roman"/>
-          <w:b w:val="0"/>
-          <w:i w:val="0"/>
-          <w:sz w:val="22"/>
-          <w:u w:val="none"/>
-          <w:lang/>
-        </w:rPr>
-        <w:t>Kantitatif (objektif) monitörizasyon; akseleromiyografi (AMG), elektromiyografi (EMG) veya kinemiyografi (KMG) gibi fiziksel/elektriksel ölçüm modalitelerini kullanarak dördüncü kasılma yanıtının ilk kasılma yanıtına olan oranını (T4​/T1​) net bir matematiksel değer olarak ekrana yansıtır.</w:t>
-      </w:r>
-    </w:p>
-    <w:p>
-      <w:pPr>
-        <w:spacing w:line="360" w:lineRule="auto" w:after="0" w:before="0"/>
-        <w:ind w:firstLine="0" w:left="0" w:right="0"/>
-        <w:jc w:val="both"/>
-        <w:rPr>
-          <w:lang/>
-        </w:rPr>
-      </w:pPr>
-      <w:r>
-        <w:rPr>
-          <w:rFonts w:ascii="Times New Roman" w:hAnsi="Times New Roman" w:cs="Times New Roman" w:eastAsia="Times New Roman"/>
-          <w:b w:val="0"/>
-          <w:bCs/>
-          <w:i w:val="0"/>
-          <w:sz w:val="22"/>
-          <w:u w:val="none"/>
-          <w:lang/>
-        </w:rPr>
-        <w:t>Güvenli Ekstübasyon Eşiği: Modern uluslararası anestezi kılavuzları, postoperatif pulmoner komplikasyon riskini en aza indirmek için objektif TOF oranının ≥ 0.90 (%90) olmasını zorunlu kılmaktadır. Myastenia Gravis gibi nöromüsküler iletim bozukluğu olan patolojilerde ise üst hava yolu reflekslerinin tam güvenliği için bu eşik değerin &gt; 0.95 (%95) seviyesinde görülmesi istenir.</w:t>
-      </w:r>
-    </w:p>
-    <w:p>
-      <w:pPr>
-        <w:spacing w:line="360" w:lineRule="auto" w:after="0" w:before="0"/>
-        <w:ind w:firstLine="0" w:left="0" w:right="0"/>
-        <w:jc w:val="both"/>
-        <w:rPr>
-          <w:lang/>
-        </w:rPr>
-      </w:pPr>
-      <w:r>
-        <w:rPr>
-          <w:rFonts w:ascii="Times New Roman" w:hAnsi="Times New Roman" w:cs="Times New Roman" w:eastAsia="Times New Roman"/>
-          <w:b w:val="0"/>
-          <w:bCs/>
-          <w:i w:val="0"/>
-          <w:sz w:val="22"/>
-          <w:u w:val="none"/>
-          <w:lang/>
-        </w:rPr>
-        <w:t>Gri Bölgenin Görünür Kılınması: Kantitatif monitörizasyon, kalitatif yöntemlerin kör noktası olan %40 ile %90 arasındaki tehlikeli rezidüel blokaj evresini kesin ve hassas bir şekilde ölçebilen yegane yöntemdir.</w:t>
-      </w:r>
-    </w:p>
-    <w:p>
-      <w:pPr>
-        <w:spacing w:line="360" w:lineRule="auto" w:after="0" w:before="0"/>
-        <w:ind w:firstLine="0" w:left="0" w:right="0"/>
-        <w:jc w:val="both"/>
-        <w:rPr>
-          <w:lang/>
-        </w:rPr>
-      </w:pPr>
-      <w:r>
-        <w:rPr>
-          <w:rFonts w:ascii="Times New Roman" w:hAnsi="Times New Roman" w:cs="Times New Roman" w:eastAsia="Times New Roman"/>
-          <w:b w:val="0"/>
-          <w:bCs/>
-          <w:i w:val="0"/>
-          <w:sz w:val="22"/>
-          <w:u w:val="none"/>
-          <w:lang/>
-        </w:rPr>
-        <w:t>Akademik Konsensüs Özeti: Robotik timektomi planlanan ve solunum rezervi sınırda seyreden (VC:2,5 L) Myastenia Gravis hastasında, intraoperatif dönemde non-depolarizan blok derinliğini izlemek ve ameliyat sonunda güvenli ekstübasyon kararı vermek için kantitatif TOF monitörizasyonu elektif bir seçenek değil, perioperatif hasta güvenliğinin yasal ve tıbbi bir zorunluluğudur. Cihaz ekranında sayısal olarak %95 derlenme görülmeden yapılacak her ekstübasyon girişimi, hastayı doğrudan postoperatif mekanik ventilasyon ihtiyacına sürükler.</w:t>
+        <w:t xml:space="preserve">Miller's Anesthesia (9th Edition, 2020) - Chapter 44: Neuromuscular Monitoring. </w:t>
       </w:r>
     </w:p>
     <w:p>
@@ -5043,72 +5083,6 @@
           <w:u w:val="none"/>
           <w:lang/>
         </w:rPr>
-        <w:t xml:space="preserve">Thilen, S. R., Weigel, W. A., Todd, M. M., et al. (2023). 2023 American Society of Anesthesiologists Practice Guidelines for Monitoring and Antagonism of Neuromuscular Blockade: A Report by the American Society of Anesthesiologists Task Force on Neuromuscular Blockade. Anesthesiology, 138(1), 13-41. </w:t>
-      </w:r>
-    </w:p>
-    <w:p>
-      <w:pPr>
-        <w:spacing w:line="360" w:lineRule="auto" w:after="0" w:before="0"/>
-        <w:ind w:left="0" w:firstLine="0" w:right="0"/>
-        <w:jc w:val="both"/>
-        <w:rPr>
-          <w:lang/>
-        </w:rPr>
-      </w:pPr>
-      <w:r>
-        <w:rPr>
-          <w:rFonts w:ascii="Times New Roman" w:hAnsi="Times New Roman" w:cs="Times New Roman" w:eastAsia="Times New Roman"/>
-          <w:b w:val="0"/>
-          <w:bCs/>
-          <w:i w:val="0"/>
-          <w:sz w:val="22"/>
-          <w:u w:val="none"/>
-          <w:lang/>
-        </w:rPr>
-        <w:t>Blichfeldt-Lauridsen, L., &amp; Hansen, B. D. (2012). Anesthesia and myasthenia gravis. Acta Anaesthesiologica Scandinavica, 56(10), 1215-1225</w:t>
-      </w:r>
-    </w:p>
-    <w:p>
-      <w:pPr>
-        <w:spacing w:line="360" w:lineRule="auto" w:after="0" w:before="0"/>
-        <w:ind w:left="0" w:firstLine="0" w:right="0"/>
-        <w:jc w:val="both"/>
-        <w:rPr>
-          <w:lang/>
-        </w:rPr>
-      </w:pPr>
-      <w:r>
-        <w:rPr>
-          <w:rFonts w:ascii="Times New Roman" w:hAnsi="Times New Roman" w:cs="Times New Roman" w:eastAsia="Times New Roman"/>
-          <w:b w:val="0"/>
-          <w:bCs/>
-          <w:i w:val="0"/>
-          <w:sz w:val="22"/>
-          <w:u w:val="none"/>
-          <w:lang/>
-        </w:rPr>
-        <w:t xml:space="preserve">Miller's Anesthesia (9th Edition, 2020) - Chapter 44: Neuromuscular Monitoring. </w:t>
-      </w:r>
-    </w:p>
-    <w:p>
-      <w:pPr>
-        <w:spacing w:line="360" w:lineRule="auto" w:after="0" w:before="0"/>
-        <w:ind w:left="0" w:firstLine="0" w:right="0"/>
-        <w:jc w:val="both"/>
-        <w:rPr>
-          <w:lang/>
-        </w:rPr>
-      </w:pPr>
-      <w:r>
-        <w:rPr>
-          <w:rFonts w:ascii="Times New Roman" w:hAnsi="Times New Roman" w:cs="Times New Roman" w:eastAsia="Times New Roman"/>
-          <w:b w:val="0"/>
-          <w:bCs/>
-          <w:i w:val="0"/>
-          <w:sz w:val="22"/>
-          <w:u w:val="none"/>
-          <w:lang/>
-        </w:rPr>
         <w:t>Brull, S. J., &amp; Kopman, A. F. (2017). Current status of neuromuscular monitoring. Current Opinion in Anaesthesiology, 30(6), 633-640</w:t>
       </w:r>
     </w:p>
@@ -5131,7 +5105,7 @@
           <w:u w:val="none"/>
           <w:lang/>
         </w:rPr>
-        <w:t>III. Geri Döndürme, Ekstübasyon ve Postoperatif Bakım</w:t>
+        <w:t>III. GERİ DÖNDÜRME, EKSTÜBASYON VE POSTOPERATİF BAKIM</w:t>
       </w:r>
     </w:p>
     <w:p>

</xml_diff>